<commit_message>
V10: carreiras de convidado não podem ser compartilhadas
Co-Authored-By: Claude Opus 5.5 <noreply@anthropic.com>
Claude-Session: https://claude.ai/code/session_01MEBCJaQ6hn6bCpcFrSTFCG
</commit_message>
<xml_diff>
--- a/docs/regras/Regras gerais da simulação - V10.docx
+++ b/docs/regras/Regras gerais da simulação - V10.docx
@@ -102,6 +102,26 @@
       </w:r>
       <w:r>
         <w:t xml:space="preserve">qualquer pessoa abre o resumo pelo link, mesmo sem conta.</w:t>
+      </w:r>
+    </w:p>
+    <w:p>
+      <w:pPr>
+        <w:pStyle w:val="ListParagraph"/>
+        <w:numPr>
+          <w:ilvl w:val="0"/>
+          <w:numId w:val="2"/>
+        </w:numPr>
+        <w:spacing w:after="60"/>
+      </w:pPr>
+      <w:r>
+        <w:rPr>
+          <w:b/>
+          <w:bCs/>
+        </w:rPr>
+        <w:t xml:space="preserve">Só quem tem conta publica: </w:t>
+      </w:r>
+      <w:r>
+        <w:t xml:space="preserve">carreiras de convidado não podem ser compartilhadas, nem depois de salvas na conta. Convidados podem ver tudo na Comunidade.</w:t>
       </w:r>
     </w:p>
     <w:p>
@@ -20356,7 +20376,33 @@
         <w:spacing w:after="60"/>
       </w:pPr>
       <w:r>
-        <w:t xml:space="preserve">É preciso estar com conta (Google ou e-mail e senha). Convidados veem um aviso para entrar e o botão "Ver a Comunidade".</w:t>
+        <w:t xml:space="preserve">Só carreiras criadas com conta (Google ou e-mail e senha). Convidados não podem publicar: o resumo mostra "Compartilhar é só para quem tem conta" e o botão "Ver a Comunidade".</w:t>
+      </w:r>
+    </w:p>
+    <w:p>
+      <w:pPr>
+        <w:pStyle w:val="ListParagraph"/>
+        <w:numPr>
+          <w:ilvl w:val="0"/>
+          <w:numId w:val="2"/>
+        </w:numPr>
+        <w:spacing w:after="60"/>
+      </w:pPr>
+      <w:r>
+        <w:t xml:space="preserve">Carreiras de convidado continuam sem poder ser publicadas mesmo depois de levadas para a conta com "Salvar na minha conta". O aviso de importação já informa isso, e o resumo dessas carreiras mostra "Carreira de convidado". Essa regra também é garantida pelo banco de dados.</w:t>
+      </w:r>
+    </w:p>
+    <w:p>
+      <w:pPr>
+        <w:pStyle w:val="ListParagraph"/>
+        <w:numPr>
+          <w:ilvl w:val="0"/>
+          <w:numId w:val="2"/>
+        </w:numPr>
+        <w:spacing w:after="60"/>
+      </w:pPr>
+      <w:r>
+        <w:t xml:space="preserve">Ver a Comunidade e abrir os links das carreiras é livre para todos, inclusive convidados e quem não tem conta.</w:t>
       </w:r>
     </w:p>
     <w:p>

</xml_diff>